<commit_message>
Rework header and section divider; clean up Act labels
- Simplify header to "AI Futures" h1 with a new .page-sub subtitle
  (mono/caps, 14px) replacing the old two-line h1 and lede
- Add a subtle .section-rule <hr> between header and first section
- Apply .soft colour to "Where we are today" h2 (muted/500-weight)
- Generalise h1 .soft → .soft so the utility class works anywhere
- Minor energy chart caption tweak ("peak and ease up around 2030")
- Update AI Futures Brief.docx

Co-Authored-By: Claude Sonnet 4.6 <noreply@anthropic.com>
</commit_message>
<xml_diff>
--- a/AI Futures Brief.docx
+++ b/AI Futures Brief.docx
@@ -333,7 +333,23 @@
           <w:kern w:val="0"/>
           <w14:ligatures w14:val="none"/>
         </w:rPr>
-        <w:t xml:space="preserve">A competed </w:t>
+        <w:t>A comp</w:t>
+      </w:r>
+      <w:r>
+        <w:rPr>
+          <w:rFonts w:eastAsia="Times New Roman" w:cstheme="minorHAnsi"/>
+          <w:kern w:val="0"/>
+          <w14:ligatures w14:val="none"/>
+        </w:rPr>
+        <w:t>l</w:t>
+      </w:r>
+      <w:r>
+        <w:rPr>
+          <w:rFonts w:eastAsia="Times New Roman" w:cstheme="minorHAnsi"/>
+          <w:kern w:val="0"/>
+          <w14:ligatures w14:val="none"/>
+        </w:rPr>
+        <w:t xml:space="preserve">eted </w:t>
       </w:r>
       <w:r>
         <w:rPr>
@@ -372,11 +388,6 @@
     </w:p>
     <w:p>
       <w:pPr>
-        <w:pStyle w:val="ListParagraph"/>
-        <w:numPr>
-          <w:ilvl w:val="1"/>
-          <w:numId w:val="3"/>
-        </w:numPr>
         <w:rPr>
           <w:rFonts w:eastAsia="Times New Roman" w:cstheme="minorHAnsi"/>
           <w:kern w:val="0"/>
@@ -384,52 +395,205 @@
           <w14:ligatures w14:val="none"/>
         </w:rPr>
       </w:pPr>
-      <w:r>
-        <w:rPr>
-          <w:rFonts w:eastAsia="Times New Roman" w:cstheme="minorHAnsi"/>
+    </w:p>
+    <w:p>
+      <w:pPr>
+        <w:rPr>
+          <w:rFonts w:eastAsia="Times New Roman" w:cstheme="minorHAnsi"/>
+          <w:kern w:val="0"/>
+          <w14:ligatures w14:val="none"/>
+        </w:rPr>
+      </w:pPr>
+      <w:r>
+        <w:rPr>
+          <w:rFonts w:eastAsia="Times New Roman" w:cstheme="minorHAnsi"/>
+          <w:b/>
+          <w:bCs/>
+          <w:kern w:val="0"/>
+          <w14:ligatures w14:val="none"/>
+        </w:rPr>
+        <w:t>Project Brief — AI Futures: A Human Alignment Explorer</w:t>
+      </w:r>
+    </w:p>
+    <w:p>
+      <w:pPr>
+        <w:rPr>
+          <w:rFonts w:eastAsia="Times New Roman" w:cstheme="minorHAnsi"/>
+          <w:kern w:val="0"/>
+          <w14:ligatures w14:val="none"/>
+        </w:rPr>
+      </w:pPr>
+    </w:p>
+    <w:p>
+      <w:pPr>
+        <w:rPr>
+          <w:rFonts w:eastAsia="Times New Roman" w:cstheme="minorHAnsi"/>
+          <w:b/>
+          <w:bCs/>
           <w:kern w:val="0"/>
           <w:highlight w:val="yellow"/>
           <w14:ligatures w14:val="none"/>
         </w:rPr>
-        <w:t>Sources cited in sub-charts (for each rank on the lever)</w:t>
-      </w:r>
-      <w:r>
-        <w:rPr>
-          <w:rFonts w:eastAsia="Times New Roman" w:cstheme="minorHAnsi"/>
+      </w:pPr>
+    </w:p>
+    <w:p>
+      <w:pPr>
+        <w:rPr>
+          <w:rFonts w:eastAsia="Times New Roman" w:cstheme="minorHAnsi"/>
+          <w:b/>
+          <w:bCs/>
           <w:kern w:val="0"/>
           <w:highlight w:val="yellow"/>
           <w14:ligatures w14:val="none"/>
         </w:rPr>
-        <w:t xml:space="preserve"> and bottom of page or in a separate page?</w:t>
-      </w:r>
-    </w:p>
-    <w:p>
-      <w:pPr>
-        <w:rPr>
-          <w:rFonts w:eastAsia="Times New Roman" w:cstheme="minorHAnsi"/>
+      </w:pPr>
+      <w:r>
+        <w:rPr>
+          <w:rFonts w:eastAsia="Times New Roman" w:cstheme="minorHAnsi"/>
+          <w:b/>
+          <w:bCs/>
           <w:kern w:val="0"/>
           <w:highlight w:val="yellow"/>
           <w14:ligatures w14:val="none"/>
         </w:rPr>
-      </w:pPr>
-    </w:p>
-    <w:p>
-      <w:pPr>
-        <w:rPr>
-          <w:rFonts w:eastAsia="Times New Roman" w:cstheme="minorHAnsi"/>
-          <w:kern w:val="0"/>
-          <w14:ligatures w14:val="none"/>
-        </w:rPr>
-      </w:pPr>
-      <w:r>
-        <w:rPr>
-          <w:rFonts w:eastAsia="Times New Roman" w:cstheme="minorHAnsi"/>
-          <w:b/>
-          <w:bCs/>
-          <w:kern w:val="0"/>
-          <w14:ligatures w14:val="none"/>
-        </w:rPr>
-        <w:t>Project Brief — AI Futures: A Human Alignment Explorer</w:t>
+        <w:t xml:space="preserve">We are at a critical juncture </w:t>
+      </w:r>
+    </w:p>
+    <w:p>
+      <w:pPr>
+        <w:rPr>
+          <w:rFonts w:eastAsia="Times New Roman" w:cstheme="minorHAnsi"/>
+          <w:b/>
+          <w:bCs/>
+          <w:kern w:val="0"/>
+          <w:highlight w:val="yellow"/>
+          <w14:ligatures w14:val="none"/>
+        </w:rPr>
+      </w:pPr>
+    </w:p>
+    <w:p>
+      <w:pPr>
+        <w:rPr>
+          <w:rFonts w:eastAsia="Times New Roman" w:cstheme="minorHAnsi"/>
+          <w:b/>
+          <w:bCs/>
+          <w:kern w:val="0"/>
+          <w:highlight w:val="yellow"/>
+          <w14:ligatures w14:val="none"/>
+        </w:rPr>
+      </w:pPr>
+      <w:r>
+        <w:rPr>
+          <w:rFonts w:eastAsia="Times New Roman" w:cstheme="minorHAnsi"/>
+          <w:b/>
+          <w:bCs/>
+          <w:kern w:val="0"/>
+          <w:highlight w:val="yellow"/>
+          <w14:ligatures w14:val="none"/>
+        </w:rPr>
+        <w:t>The irony is that this was built with AI</w:t>
+      </w:r>
+      <w:r>
+        <w:rPr>
+          <w:rFonts w:eastAsia="Times New Roman" w:cstheme="minorHAnsi"/>
+          <w:b/>
+          <w:bCs/>
+          <w:kern w:val="0"/>
+          <w:highlight w:val="yellow"/>
+          <w14:ligatures w14:val="none"/>
+        </w:rPr>
+        <w:t>, serving as an example of the positive output</w:t>
+      </w:r>
+      <w:r>
+        <w:rPr>
+          <w:rFonts w:eastAsia="Times New Roman" w:cstheme="minorHAnsi"/>
+          <w:b/>
+          <w:bCs/>
+          <w:kern w:val="0"/>
+          <w:highlight w:val="yellow"/>
+          <w14:ligatures w14:val="none"/>
+        </w:rPr>
+        <w:t>s that are possible with this technology</w:t>
+      </w:r>
+    </w:p>
+    <w:p>
+      <w:pPr>
+        <w:rPr>
+          <w:rFonts w:eastAsia="Times New Roman" w:cstheme="minorHAnsi"/>
+          <w:b/>
+          <w:bCs/>
+          <w:kern w:val="0"/>
+          <w:highlight w:val="yellow"/>
+          <w14:ligatures w14:val="none"/>
+        </w:rPr>
+      </w:pPr>
+    </w:p>
+    <w:p>
+      <w:pPr>
+        <w:rPr>
+          <w:rFonts w:eastAsia="Times New Roman" w:cstheme="minorHAnsi"/>
+          <w:b/>
+          <w:bCs/>
+          <w:kern w:val="0"/>
+          <w:highlight w:val="yellow"/>
+          <w14:ligatures w14:val="none"/>
+        </w:rPr>
+      </w:pPr>
+      <w:r>
+        <w:rPr>
+          <w:rFonts w:eastAsia="Times New Roman" w:cstheme="minorHAnsi"/>
+          <w:b/>
+          <w:bCs/>
+          <w:kern w:val="0"/>
+          <w:highlight w:val="yellow"/>
+          <w14:ligatures w14:val="none"/>
+        </w:rPr>
+        <w:t>(Add AI quotes from Yuval and other figures)</w:t>
+      </w:r>
+    </w:p>
+    <w:p>
+      <w:pPr>
+        <w:rPr>
+          <w:rFonts w:eastAsia="Times New Roman" w:cstheme="minorHAnsi"/>
+          <w:b/>
+          <w:bCs/>
+          <w:kern w:val="0"/>
+          <w:highlight w:val="yellow"/>
+          <w14:ligatures w14:val="none"/>
+        </w:rPr>
+      </w:pPr>
+    </w:p>
+    <w:p>
+      <w:pPr>
+        <w:rPr>
+          <w:rFonts w:eastAsia="Times New Roman" w:cstheme="minorHAnsi"/>
+          <w:b/>
+          <w:bCs/>
+          <w:kern w:val="0"/>
+          <w14:ligatures w14:val="none"/>
+        </w:rPr>
+      </w:pPr>
+      <w:r>
+        <w:rPr>
+          <w:rFonts w:eastAsia="Times New Roman" w:cstheme="minorHAnsi"/>
+          <w:b/>
+          <w:bCs/>
+          <w:kern w:val="0"/>
+          <w:highlight w:val="yellow"/>
+          <w14:ligatures w14:val="none"/>
+        </w:rPr>
+        <w:t>“We are so focused on the fact that we can now build anything, that no one is</w:t>
+      </w:r>
+      <w:r>
+        <w:rPr>
+          <w:rFonts w:eastAsia="Times New Roman" w:cstheme="minorHAnsi"/>
+          <w:b/>
+          <w:bCs/>
+          <w:kern w:val="0"/>
+          <w:highlight w:val="yellow"/>
+          <w14:ligatures w14:val="none"/>
+        </w:rPr>
+        <w:t xml:space="preserve"> stopping to ask what should we build?”</w:t>
       </w:r>
     </w:p>
     <w:p>
@@ -533,6 +697,7 @@
           <w:kern w:val="0"/>
           <w14:ligatures w14:val="none"/>
         </w:rPr>
+        <w:lastRenderedPageBreak/>
         <w:t xml:space="preserve">The intellectual anchor is a distinction </w:t>
       </w:r>
       <w:r>
@@ -1453,6 +1618,19 @@
         <w:t>: CC BY 4.0</w:t>
       </w:r>
     </w:p>
+    <w:p>
+      <w:hyperlink r:id="rId9" w:history="1">
+        <w:r>
+          <w:rPr>
+            <w:rStyle w:val="Hyperlink"/>
+          </w:rPr>
+          <w:t>https://www.iea.org/reports/energy-and-ai/executive-summary?__cf_chl_f_tk=H9RDWpiQPf9w63.MIePc1Ny1t1OhTT1BzeE_viuRQQQ-1782916189-1.0.1.1-S3F0leLEeslB2clRy25iYoiiKCG3I96shudchYc7snQ</w:t>
+        </w:r>
+      </w:hyperlink>
+      <w:r>
+        <w:t xml:space="preserve"> </w:t>
+      </w:r>
+    </w:p>
     <w:p/>
     <w:p/>
     <w:p>
@@ -1474,7 +1652,7 @@
     </w:p>
     <w:p/>
     <w:p>
-      <w:hyperlink r:id="rId9" w:history="1">
+      <w:hyperlink r:id="rId10" w:history="1">
         <w:r>
           <w:rPr>
             <w:rStyle w:val="Hyperlink"/>
@@ -1483,7 +1661,25 @@
         </w:r>
       </w:hyperlink>
     </w:p>
+    <w:p>
+      <w:r>
+        <w:t>Epoch AI, 'AI Benchmarking Hub'. Published online at epoch.ai. Retrieved from 'https://epoch.ai/benchmarks/use-this-data' [online resource]. Accessed 30 Jun 2026.</w:t>
+      </w:r>
+    </w:p>
     <w:p/>
+    <w:p>
+      <w:hyperlink r:id="rId11" w:history="1">
+        <w:r>
+          <w:rPr>
+            <w:rStyle w:val="Hyperlink"/>
+          </w:rPr>
+          <w:t>https://www.iea.org/data-and-statistics/data-product/energy-and-ai#data-set</w:t>
+        </w:r>
+      </w:hyperlink>
+      <w:r>
+        <w:t xml:space="preserve"> </w:t>
+      </w:r>
+    </w:p>
     <w:p>
       <w:r>
         <w:t>IEA, </w:t>
@@ -1507,8 +1703,73 @@
         <w:t>: Terms of Use for Non-CC Material</w:t>
       </w:r>
     </w:p>
-    <w:p>
-      <w:hyperlink r:id="rId10" w:history="1">
+    <w:p/>
+    <w:p>
+      <w:hyperlink r:id="rId12" w:history="1">
+        <w:r>
+          <w:rPr>
+            <w:rStyle w:val="Hyperlink"/>
+          </w:rPr>
+          <w:t>https://www.iea.org/data-and-statistics/charts/sources-of-global-electricity-generation-for-data-centres-base-case-2020-2035</w:t>
+        </w:r>
+      </w:hyperlink>
+    </w:p>
+    <w:p>
+      <w:r>
+        <w:t xml:space="preserve">IEA (2025), Sources of global electricity generation for data </w:t>
+      </w:r>
+      <w:proofErr w:type="spellStart"/>
+      <w:r>
+        <w:t>centres</w:t>
+      </w:r>
+      <w:proofErr w:type="spellEnd"/>
+      <w:r>
+        <w:t xml:space="preserve">, Base Case, 2020-2035, IEA, Paris https://www.iea.org/data-and-statistics/charts/sources-of-global-electricity-generation-for-data-centres-base-case-2020-2035, </w:t>
+      </w:r>
+      <w:proofErr w:type="spellStart"/>
+      <w:r>
+        <w:t>Licence</w:t>
+      </w:r>
+      <w:proofErr w:type="spellEnd"/>
+      <w:r>
+        <w:t>: CC BY 4.0</w:t>
+      </w:r>
+    </w:p>
+    <w:p/>
+    <w:p>
+      <w:hyperlink r:id="rId13" w:history="1">
+        <w:r>
+          <w:rPr>
+            <w:rStyle w:val="Hyperlink"/>
+          </w:rPr>
+          <w:t>https://www.iea.org/data-and-statistics/charts/global-data-centre-co2-emissions-base-case-2020-2035</w:t>
+        </w:r>
+      </w:hyperlink>
+    </w:p>
+    <w:p>
+      <w:r>
+        <w:t xml:space="preserve">IEA (2025), Global data </w:t>
+      </w:r>
+      <w:proofErr w:type="spellStart"/>
+      <w:r>
+        <w:t>centre</w:t>
+      </w:r>
+      <w:proofErr w:type="spellEnd"/>
+      <w:r>
+        <w:t xml:space="preserve"> CO2 emissions, Base Case, 2020-2035, IEA, Paris https://www.iea.org/data-and-statistics/charts/global-data-centre-co2-emissions-base-case-2020-2035, </w:t>
+      </w:r>
+      <w:proofErr w:type="spellStart"/>
+      <w:r>
+        <w:t>Licence</w:t>
+      </w:r>
+      <w:proofErr w:type="spellEnd"/>
+      <w:r>
+        <w:t>: CC BY 4.0</w:t>
+      </w:r>
+    </w:p>
+    <w:p/>
+    <w:p>
+      <w:hyperlink r:id="rId14" w:history="1">
         <w:r>
           <w:rPr>
             <w:rStyle w:val="Hyperlink"/>
@@ -1524,10 +1785,24 @@
       <w:r>
         <w:t>McGregor, S. (2021) Preventing Repeated Real World AI Failures by Cataloging Incidents: The AI Incident Database. In Proceedings of the Thirty-Third Annual Conference on Innovative Applications of Artificial Intelligence (IAAI-21). Virtual Conference.</w:t>
       </w:r>
+      <w:r>
+        <w:br/>
+      </w:r>
+      <w:hyperlink r:id="rId15" w:history="1">
+        <w:r>
+          <w:rPr>
+            <w:rStyle w:val="Hyperlink"/>
+          </w:rPr>
+          <w:t>https://incidentdatabase.ai/apps/incidents/</w:t>
+        </w:r>
+      </w:hyperlink>
+      <w:r>
+        <w:t xml:space="preserve"> </w:t>
+      </w:r>
     </w:p>
     <w:p/>
     <w:sectPr>
-      <w:headerReference w:type="default" r:id="rId11"/>
+      <w:headerReference w:type="default" r:id="rId16"/>
       <w:pgSz w:w="12240" w:h="15840"/>
       <w:pgMar w:top="1440" w:right="1440" w:bottom="1440" w:left="1440" w:header="720" w:footer="720" w:gutter="0"/>
       <w:cols w:space="720"/>

</xml_diff>

<commit_message>
Add copyright protections and finalize title
- Add All Rights Reserved copyright banner comment and author/copyright
  meta tags to the HTML head
- Add visible footer credit line (Created by Nicholas Sutherland)
- Add LICENSE file (All Rights Reserved) at repo root
- Update page <title> to "AI Futures" to match the H1
- Update AI Futures Brief.docx

Co-Authored-By: Claude Opus 4.8 <noreply@anthropic.com>
</commit_message>
<xml_diff>
--- a/AI Futures Brief.docx
+++ b/AI Futures Brief.docx
@@ -428,6 +428,35 @@
       <w:pPr>
         <w:rPr>
           <w:rFonts w:eastAsia="Times New Roman" w:cstheme="minorHAnsi"/>
+          <w:kern w:val="0"/>
+          <w14:ligatures w14:val="none"/>
+        </w:rPr>
+      </w:pPr>
+      <w:r>
+        <w:rPr>
+          <w:rFonts w:ascii="Segoe UI" w:hAnsi="Segoe UI" w:cs="Segoe UI"/>
+          <w:color w:val="E2E1DA"/>
+          <w:sz w:val="21"/>
+          <w:szCs w:val="21"/>
+          <w:shd w:val="clear" w:color="auto" w:fill="1F1F1E"/>
+        </w:rPr>
+        <w:t>copyright.gov</w:t>
+      </w:r>
+      <w:r>
+        <w:rPr>
+          <w:rFonts w:ascii="Segoe UI" w:hAnsi="Segoe UI" w:cs="Segoe UI"/>
+          <w:color w:val="E2E1DA"/>
+          <w:sz w:val="21"/>
+          <w:szCs w:val="21"/>
+          <w:shd w:val="clear" w:color="auto" w:fill="1F1F1E"/>
+        </w:rPr>
+        <w:t xml:space="preserve"> &lt;&lt;&lt;&lt;&lt;&lt;&lt;&lt;&lt;&lt;&lt;</w:t>
+      </w:r>
+    </w:p>
+    <w:p>
+      <w:pPr>
+        <w:rPr>
+          <w:rFonts w:eastAsia="Times New Roman" w:cstheme="minorHAnsi"/>
           <w:b/>
           <w:bCs/>
           <w:kern w:val="0"/>
@@ -680,17 +709,8 @@
           <w:kern w:val="0"/>
           <w14:ligatures w14:val="none"/>
         </w:rPr>
-        <w:t>What this project deliberately does not do is tell you what to think. There is no correct setting on the levers. There is no hidden argument about which future is right. The goal is to make the trade-offs visible and felt — to turn an abstract civilizational question into something a person can hold in their hands and explore.</w:t>
-      </w:r>
-    </w:p>
-    <w:p>
-      <w:pPr>
-        <w:rPr>
-          <w:rFonts w:eastAsia="Times New Roman" w:cstheme="minorHAnsi"/>
-          <w:kern w:val="0"/>
-          <w14:ligatures w14:val="none"/>
-        </w:rPr>
-      </w:pPr>
+        <w:t xml:space="preserve">What this project deliberately does not do is tell you what to think. There is no correct setting on the levers. There is no hidden argument about which future is right. The goal is to make the </w:t>
+      </w:r>
       <w:r>
         <w:rPr>
           <w:rFonts w:eastAsia="Times New Roman" w:cstheme="minorHAnsi"/>
@@ -698,6 +718,23 @@
           <w14:ligatures w14:val="none"/>
         </w:rPr>
         <w:lastRenderedPageBreak/>
+        <w:t>trade-offs visible and felt — to turn an abstract civilizational question into something a person can hold in their hands and explore.</w:t>
+      </w:r>
+    </w:p>
+    <w:p>
+      <w:pPr>
+        <w:rPr>
+          <w:rFonts w:eastAsia="Times New Roman" w:cstheme="minorHAnsi"/>
+          <w:kern w:val="0"/>
+          <w14:ligatures w14:val="none"/>
+        </w:rPr>
+      </w:pPr>
+      <w:r>
+        <w:rPr>
+          <w:rFonts w:eastAsia="Times New Roman" w:cstheme="minorHAnsi"/>
+          <w:kern w:val="0"/>
+          <w14:ligatures w14:val="none"/>
+        </w:rPr>
         <w:t xml:space="preserve">The intellectual anchor is a distinction </w:t>
       </w:r>
       <w:r>
@@ -1508,6 +1545,7 @@
           <w:kern w:val="0"/>
           <w14:ligatures w14:val="none"/>
         </w:rPr>
+        <w:lastRenderedPageBreak/>
         <w:t xml:space="preserve">Day 5 </w:t>
       </w:r>
       <w:r>

</xml_diff>